<commit_message>
260618 - Ajustando a documentação
</commit_message>
<xml_diff>
--- a/documentation/Daily Scrum/📅 Daily Scrum – 260616.docx
+++ b/documentation/Daily Scrum/📅 Daily Scrum – 260616.docx
@@ -209,6 +209,10 @@
         </w:drawing>
       </w:r>
     </w:p>
+    <w:p/>
+    <w:p/>
+    <w:p/>
+    <w:p/>
     <w:sectPr>
       <w:pgSz w:w="11909" w:h="16834"/>
       <w:pgMar w:top="1440" w:right="1440" w:bottom="1440" w:left="1440" w:header="720" w:footer="720" w:gutter="0"/>

</xml_diff>